<commit_message>
05-20-62123: map alt text exactly as the template builds it
The map alt text is now the Assumptions Q12:Q15 rows verbatim, in the
sheet's order (West, East, North, South), one per line, as the template's
"Copy each row into the Alt Text for the Map" asks. It replaces a lead
sentence and a reordered leg list. It is on the workbook map picture and
the one pager map picture alike. The one pager picture no longer carries
a title attribute, which Word's Alt Text pane never writes.

Co-Authored-By: Claude Opus 5.5 <noreply@anthropic.com>
Claude-Session: https://claude.ai/code/session_01UzM4sZHfA2PkELFhftQzNK
</commit_message>
<xml_diff>
--- a/deliverables/05-20-62123/41000076579_OnePager.docx
+++ b/deliverables/05-20-62123/41000076579_OnePager.docx
@@ -5832,7 +5832,7 @@
           <wp:inline distT="0" distB="0" distL="0" distR="0" wp14:anchorId="54260F83" wp14:editId="0C6FFE55">
             <wp:extent cx="3886200" cy="2102922"/>
             <wp:effectExtent l="0" t="0" r="0" b="0"/>
-            <wp:docPr id="1" name="Map/Satellite View" descr="Aerial view, north up, of the mini-roundabout at SR 1602 (Main Street) and SR 1207 (Spring Street) in Oxford, with a location map inset. North leg: SR 1602 (Main Street), 25 mph, 2025 AADT: 2500. South leg: SR 1602 (Main Street), 25 mph, 2025 AADT: 1300. West leg: SR 1207 (Spring Street), 35 mph, 2025 AADT: 2800. East leg: E Spring Street, 35 mph, 2025 AADT: 1900." title="Map/Satellite View"/>
+            <wp:docPr id="1" name="Map/Satellite View" descr="West leg: SR 1207 (Spring Street), 35 mph, 2025 AADT: 2800&#10;East leg: E Spring Street, 35 mph, 2025 AADT: 1900&#10;North leg: SR 1602 (Main Street), 25 mph, 2025 AADT: 2500&#10;South leg: SR 1602 (Main Street), 25 mph, 2025 AADT: 1300"/>
             <wp:cNvGraphicFramePr>
               <a:graphicFrameLocks xmlns:a="http://schemas.openxmlformats.org/drawingml/2006/main" noChangeAspect="1"/>
             </wp:cNvGraphicFramePr>
@@ -5840,7 +5840,7 @@
               <a:graphicData uri="http://schemas.openxmlformats.org/drawingml/2006/picture">
                 <pic:pic xmlns:pic="http://schemas.openxmlformats.org/drawingml/2006/picture">
                   <pic:nvPicPr>
-                    <pic:cNvPr id="1" name="Map/Satellite View" descr="Aerial view, north up, of the mini-roundabout at SR 1602 (Main Street) and SR 1207 (Spring Street) in Oxford, with a location map inset. North leg: SR 1602 (Main Street), 25 mph, 2025 AADT: 2500. South leg: SR 1602 (Main Street), 25 mph, 2025 AADT: 1300. West leg: SR 1207 (Spring Street), 35 mph, 2025 AADT: 2800. East leg: E Spring Street, 35 mph, 2025 AADT: 1900."/>
+                    <pic:cNvPr id="1" name="Map/Satellite View" descr="West leg: SR 1207 (Spring Street), 35 mph, 2025 AADT: 2800&#10;East leg: E Spring Street, 35 mph, 2025 AADT: 1900&#10;North leg: SR 1602 (Main Street), 25 mph, 2025 AADT: 2500&#10;South leg: SR 1602 (Main Street), 25 mph, 2025 AADT: 1300"/>
                     <pic:cNvPicPr/>
                   </pic:nvPicPr>
                   <pic:blipFill>

</xml_diff>